<commit_message>
Derecho Animal: fill in title page author details
Co-Authored-By: Claude Opus 5.5 <noreply@anthropic.com>
Claude-Session: https://claude.ai/code/session_01Sruou9rVjXoroyFKmu18Rp
</commit_message>
<xml_diff>
--- a/docs/two-gazettes/derecho-animal/2-UPLOAD-title-page-portadilla.docx
+++ b/docs/two-gazettes/derecho-animal/2-UPLOAD-title-page-portadilla.docx
@@ -57,7 +57,7 @@
           <w:sz w:val="24"/>
           <w:szCs w:val="24"/>
         </w:rPr>
-        <w:t xml:space="preserve">[Nombre y apellidos / Full name]</w:t>
+        <w:t xml:space="preserve">Uğurcan Al</w:t>
       </w:r>
     </w:p>
     <w:p>
@@ -83,7 +83,7 @@
           <w:sz w:val="24"/>
           <w:szCs w:val="24"/>
         </w:rPr>
-        <w:t xml:space="preserve">[Universidad o centro, departamento, lugar de trabajo, ciudad, país / University or centre, department, workplace, city, country]</w:t>
+        <w:t xml:space="preserve">Dokuz Eylül University, Vocational School of Health Services (Sağlık Hizmetleri Meslek Yüksekokulu), Laboratory Animal Science programme, İzmir, Türkiye</w:t>
       </w:r>
     </w:p>
     <w:p>
@@ -109,7 +109,7 @@
           <w:sz w:val="24"/>
           <w:szCs w:val="24"/>
         </w:rPr>
-        <w:t xml:space="preserve">[correo electrónico de contacto / corresponding e-mail]</w:t>
+        <w:t xml:space="preserve">uurcanal@gmail.com</w:t>
       </w:r>
     </w:p>
     <w:p>
@@ -135,7 +135,7 @@
           <w:sz w:val="24"/>
           <w:szCs w:val="24"/>
         </w:rPr>
-        <w:t xml:space="preserve">[Máx. 60 caracteres: titulación más alta, posición actual, líneas de investigación / Max. 60 characters: highest degree, current position, research lines]</w:t>
+        <w:t xml:space="preserve">BA Int. Relations (DEU); lab animal student; EU animal law</w:t>
       </w:r>
     </w:p>
     <w:p>
@@ -161,7 +161,7 @@
           <w:sz w:val="24"/>
           <w:szCs w:val="24"/>
         </w:rPr>
-        <w:t xml:space="preserve">[0000-0000-0000-0000]</w:t>
+        <w:t xml:space="preserve">[optional: add your ORCID iD if you have one, or delete this line]</w:t>
       </w:r>
     </w:p>
     <w:p>

</xml_diff>

<commit_message>
Derecho Animal: describe associate degree programme on title page
Co-Authored-By: Claude Opus 5.5 <noreply@anthropic.com>
Claude-Session: https://claude.ai/code/session_01Sruou9rVjXoroyFKmu18Rp
</commit_message>
<xml_diff>
--- a/docs/two-gazettes/derecho-animal/2-UPLOAD-title-page-portadilla.docx
+++ b/docs/two-gazettes/derecho-animal/2-UPLOAD-title-page-portadilla.docx
@@ -83,7 +83,7 @@
           <w:sz w:val="24"/>
           <w:szCs w:val="24"/>
         </w:rPr>
-        <w:t xml:space="preserve">Dokuz Eylül University, Vocational School of Health Services (Sağlık Hizmetleri Meslek Yüksekokulu), Laboratory Animal Science programme, İzmir, Türkiye</w:t>
+        <w:t xml:space="preserve">Dokuz Eylül University, Vocational School of Health Services (Sağlık Hizmetleri Meslek Yüksekokulu), Associate Degree Programme in Laboratory Animal Science, İzmir, Türkiye</w:t>
       </w:r>
     </w:p>
     <w:p>
@@ -135,7 +135,7 @@
           <w:sz w:val="24"/>
           <w:szCs w:val="24"/>
         </w:rPr>
-        <w:t xml:space="preserve">BA Int. Relations (DEU); lab animal student; EU animal law</w:t>
+        <w:t xml:space="preserve">BA Int. Relations (DEU); assoc. degree student, lab animals</w:t>
       </w:r>
     </w:p>
     <w:p>

</xml_diff>